<commit_message>
Modification Figures C7 et C9. Mise à jour pdf et docx
</commit_message>
<xml_diff>
--- a/docs/exports/C01/C01_NI43101.docx
+++ b/docs/exports/C01/C01_NI43101.docx
@@ -378,7 +378,7 @@
         <w:pStyle w:val="Heading3"/>
       </w:pPr>
       <w:r>
-        <w:t xml:space="preserve">1.1 Introduction aux rapports techniques miniers</w:t>
+        <w:t xml:space="preserve">Introduction aux rapports techniques miniers</w:t>
       </w:r>
     </w:p>
     <w:p>
@@ -456,7 +456,7 @@
         <w:pStyle w:val="Heading3"/>
       </w:pPr>
       <w:r>
-        <w:t xml:space="preserve">1.2 Notion de confiance et niveaux d’incertitude</w:t>
+        <w:t xml:space="preserve">Notion de confiance et niveaux d’incertitude</w:t>
       </w:r>
     </w:p>
     <w:p>
@@ -744,7 +744,7 @@
         <w:pStyle w:val="Heading3"/>
       </w:pPr>
       <w:r>
-        <w:t xml:space="preserve">2.1 Introduction aux modèles de blocs</w:t>
+        <w:t xml:space="preserve">Introduction aux modèles de blocs</w:t>
       </w:r>
     </w:p>
     <w:p>
@@ -1023,7 +1023,7 @@
         <w:pStyle w:val="Heading3"/>
       </w:pPr>
       <w:r>
-        <w:t xml:space="preserve">2.2 Ressources et réserves</w:t>
+        <w:t xml:space="preserve">Ressources et réserves</w:t>
       </w:r>
     </w:p>
     <w:p>
@@ -1081,7 +1081,7 @@
         <w:pStyle w:val="Heading3"/>
       </w:pPr>
       <w:r>
-        <w:t xml:space="preserve">2.3 Catégories de ressources et de réserves</w:t>
+        <w:t xml:space="preserve">Catégories de ressources et de réserves</w:t>
       </w:r>
     </w:p>
     <w:p>
@@ -1799,7 +1799,7 @@
         <w:pStyle w:val="Heading3"/>
       </w:pPr>
       <w:r>
-        <w:t xml:space="preserve">2.4 Disponibilité des rapports techniques NI 43-101</w:t>
+        <w:t xml:space="preserve">Disponibilité des rapports techniques NI 43-101</w:t>
       </w:r>
     </w:p>
     <w:p>
@@ -1929,7 +1929,7 @@
         <w:pStyle w:val="Heading3"/>
       </w:pPr>
       <w:r>
-        <w:t xml:space="preserve">3.1 Expérience de la personne qualifiée</w:t>
+        <w:t xml:space="preserve">Expérience de la personne qualifiée</w:t>
       </w:r>
     </w:p>
     <w:p>
@@ -2007,7 +2007,7 @@
         <w:pStyle w:val="Heading3"/>
       </w:pPr>
       <w:r>
-        <w:t xml:space="preserve">3.2 Responsabilités de la personne qualifiée</w:t>
+        <w:t xml:space="preserve">Responsabilités de la personne qualifiée</w:t>
       </w:r>
     </w:p>
     <w:p>
@@ -2057,7 +2057,7 @@
         <w:pStyle w:val="Heading3"/>
       </w:pPr>
       <w:r>
-        <w:t xml:space="preserve">3.3 Certificats et consentements</w:t>
+        <w:t xml:space="preserve">Certificats et consentements</w:t>
       </w:r>
     </w:p>
     <w:p>
@@ -2267,7 +2267,7 @@
         <w:pStyle w:val="Heading3"/>
       </w:pPr>
       <w:r>
-        <w:t xml:space="preserve">4.1 Liste des rubriques du rapport NI 43-101</w:t>
+        <w:t xml:space="preserve">Liste des rubriques du rapport NI 43-101</w:t>
       </w:r>
     </w:p>
     <w:p>
@@ -2843,7 +2843,7 @@
         <w:pStyle w:val="Heading3"/>
       </w:pPr>
       <w:r>
-        <w:t xml:space="preserve">4.2 Remarques finales</w:t>
+        <w:t xml:space="preserve">Remarques finales</w:t>
       </w:r>
     </w:p>
     <w:p>
@@ -3040,7 +3040,7 @@
         <w:pStyle w:val="Heading3"/>
       </w:pPr>
       <w:r>
-        <w:t xml:space="preserve">5.1 Droit minier québécois actuel</w:t>
+        <w:t xml:space="preserve">Droit minier québécois actuel</w:t>
       </w:r>
     </w:p>
     <w:p>
@@ -5810,7 +5810,7 @@
         <w:pStyle w:val="Heading3"/>
       </w:pPr>
       <w:r>
-        <w:t xml:space="preserve">5.2 Permis et baux d’exploitation</w:t>
+        <w:t xml:space="preserve">Permis et baux d’exploitation</w:t>
       </w:r>
     </w:p>
     <w:p>
@@ -6091,7 +6091,7 @@
         <w:pStyle w:val="Heading4"/>
       </w:pPr>
       <w:r>
-        <w:t xml:space="preserve">5.2.1 Redevances sur les substances minérales de surface</w:t>
+        <w:t xml:space="preserve">Redevances sur les substances minérales de surface</w:t>
       </w:r>
     </w:p>
     <w:p>
@@ -6362,7 +6362,7 @@
         <w:pStyle w:val="Heading3"/>
       </w:pPr>
       <w:r>
-        <w:t xml:space="preserve">5.3 Modifications législatives de 2013</w:t>
+        <w:t xml:space="preserve">Modifications législatives de 2013</w:t>
       </w:r>
     </w:p>
     <w:p>
@@ -6379,7 +6379,7 @@
         <w:pStyle w:val="Heading4"/>
       </w:pPr>
       <w:r>
-        <w:t xml:space="preserve">5.3.1 Obligations et responsabilités accrues des titulaires de droits miniers</w:t>
+        <w:t xml:space="preserve">Obligations et responsabilités accrues des titulaires de droits miniers</w:t>
       </w:r>
     </w:p>
     <w:p>
@@ -6455,7 +6455,7 @@
         <w:pStyle w:val="Heading4"/>
       </w:pPr>
       <w:r>
-        <w:t xml:space="preserve">5.3.2 Transparence accrue</w:t>
+        <w:t xml:space="preserve">Transparence accrue</w:t>
       </w:r>
     </w:p>
     <w:p>
@@ -6521,7 +6521,7 @@
         <w:pStyle w:val="Heading3"/>
       </w:pPr>
       <w:r>
-        <w:t xml:space="preserve">5.4 Modifications législatives de 2024</w:t>
+        <w:t xml:space="preserve">Modifications législatives de 2024</w:t>
       </w:r>
     </w:p>
     <w:p>
@@ -6538,7 +6538,7 @@
         <w:pStyle w:val="Heading4"/>
       </w:pPr>
       <w:r>
-        <w:t xml:space="preserve">5.4.1 Principaux changements apportés par la Loi 63 (2024)</w:t>
+        <w:t xml:space="preserve">Principaux changements apportés par la Loi 63 (2024)</w:t>
       </w:r>
     </w:p>
     <w:p>
@@ -6725,7 +6725,7 @@
         <w:pStyle w:val="Heading3"/>
       </w:pPr>
       <w:r>
-        <w:t xml:space="preserve">5.5 Cartes des titres miniers, des contraintes à l’exploration et des projets miniers au Québec</w:t>
+        <w:t xml:space="preserve">Cartes des titres miniers, des contraintes à l’exploration et des projets miniers au Québec</w:t>
       </w:r>
     </w:p>
     <w:p>
@@ -6900,7 +6900,7 @@
         <w:pStyle w:val="Heading4"/>
       </w:pPr>
       <w:r>
-        <w:t xml:space="preserve">5.5.1 Titres miniers actifs et contraintes à l’exploration</w:t>
+        <w:t xml:space="preserve">Titres miniers actifs et contraintes à l’exploration</w:t>
       </w:r>
     </w:p>
     <w:p>
@@ -7118,7 +7118,7 @@
         <w:pStyle w:val="Heading4"/>
       </w:pPr>
       <w:r>
-        <w:t xml:space="preserve">5.5.2 Mines actives, mines en maintenance et projets miniers</w:t>
+        <w:t xml:space="preserve">Mines actives, mines en maintenance et projets miniers</w:t>
       </w:r>
     </w:p>
     <w:p>

</xml_diff>